<commit_message>
Fix split placeholders in zayavka template, use short names ЗАК_КР/ИСП_КР
Co-Authored-By: Claude Sonnet 4.6 <noreply@anthropic.com>
</commit_message>
<xml_diff>
--- a/template_zayavka.docx
+++ b/template_zayavka.docx
@@ -8788,26 +8788,7 @@
                 <w:sz w:val="20"/>
                 <w:szCs w:val="20"/>
               </w:rPr>
-              <w:t>{ЗАКАЗЧИК_ПОДПИСАНТ</w:t>
-            </w:r>
-          </w:p>
-          <w:p>
-            <w:pPr>
-              <w:pStyle w:val="TableParagraph"/>
-              <w:ind w:left="0"/>
-              <w:rPr>
-                <w:spacing w:val="-4"/>
-                <w:sz w:val="20"/>
-                <w:szCs w:val="20"/>
-              </w:rPr>
-            </w:pPr>
-            <w:r>
-              <w:rPr>
-                <w:spacing w:val="-4"/>
-                <w:sz w:val="20"/>
-                <w:szCs w:val="20"/>
-              </w:rPr>
-              <w:t>_КРАТКО}</w:t>
+              <w:t>{ЗАК_КР}</w:t>
             </w:r>
           </w:p>
           <w:p>
@@ -9145,26 +9126,7 @@
                 <w:sz w:val="20"/>
                 <w:szCs w:val="20"/>
               </w:rPr>
-              <w:t>{ИСПОЛНИТЕЛЬ_</w:t>
-            </w:r>
-          </w:p>
-          <w:p>
-            <w:pPr>
-              <w:pStyle w:val="TableParagraph"/>
-              <w:ind w:left="0"/>
-              <w:rPr>
-                <w:spacing w:val="-4"/>
-                <w:sz w:val="20"/>
-                <w:szCs w:val="20"/>
-              </w:rPr>
-            </w:pPr>
-            <w:r>
-              <w:rPr>
-                <w:spacing w:val="-2"/>
-                <w:sz w:val="20"/>
-                <w:szCs w:val="20"/>
-              </w:rPr>
-              <w:t>ПОДПИСАНТ_КРАТКО}</w:t>
+              <w:t>{ИСП_КР}</w:t>
             </w:r>
           </w:p>
           <w:p>

</xml_diff>